<commit_message>
hapus sub bab Ilustrasi Perhitungan Manual WKNN dengan Kedua Metrik Jarak
</commit_message>
<xml_diff>
--- a/main/main_draf_Belhart.docx
+++ b/main/main_draf_Belhart.docx
@@ -13933,2716 +13933,6 @@
       <w:proofErr w:type="spellEnd"/>
       <w:r>
         <w:t>.</w:t>
-      </w:r>
-    </w:p>
-    <w:p>
-      <w:pPr>
-        <w:pStyle w:val="Heading3"/>
-      </w:pPr>
-      <w:r>
-        <w:t>Ilustrasi Perhitungan Manual WKNN dengan Kedua Metrik Jarak</w:t>
-      </w:r>
-    </w:p>
-    <w:p>
-      <w:r>
-        <w:tab/>
-      </w:r>
-      <w:r>
-        <w:t xml:space="preserve">Untuk memberikan gambaran perbandingan antara kedua metrik jarak, digunakan sampel data yang sama dengan ilustrasi pada Bab III, yaitu tiga data latih (D1, D2, D3) dan satu data uji (U1) yang telah melalui tahap TF-IDF, sebagaimana ditunjukkan pada </w:t>
-      </w:r>
-      <w:r>
-        <w:rPr>
-          <w:color w:val="EE0000"/>
-        </w:rPr>
-        <w:t>Tabel II</w:t>
-      </w:r>
-      <w:r>
-        <w:t>.8.</w:t>
-      </w:r>
-    </w:p>
-    <w:tbl>
-      <w:tblPr>
-        <w:tblStyle w:val="TableGrid"/>
-        <w:tblW w:w="0" w:type="auto"/>
-        <w:tblLook w:val="04A0" w:firstRow="1" w:lastRow="0" w:firstColumn="1" w:lastColumn="0" w:noHBand="0" w:noVBand="1"/>
-      </w:tblPr>
-      <w:tblGrid>
-        <w:gridCol w:w="1585"/>
-        <w:gridCol w:w="1585"/>
-        <w:gridCol w:w="1585"/>
-        <w:gridCol w:w="1586"/>
-        <w:gridCol w:w="1586"/>
-      </w:tblGrid>
-      <w:tr>
-        <w:tc>
-          <w:tcPr>
-            <w:tcW w:w="1585" w:type="dxa"/>
-          </w:tcPr>
-          <w:p>
-            <w:pPr>
-              <w:jc w:val="center"/>
-              <w:rPr>
-                <w:b/>
-                <w:bCs/>
-              </w:rPr>
-            </w:pPr>
-            <w:r>
-              <w:rPr>
-                <w:b/>
-                <w:bCs/>
-              </w:rPr>
-              <w:t>Term</w:t>
-            </w:r>
-          </w:p>
-        </w:tc>
-        <w:tc>
-          <w:tcPr>
-            <w:tcW w:w="1585" w:type="dxa"/>
-          </w:tcPr>
-          <w:p>
-            <w:pPr>
-              <w:jc w:val="center"/>
-              <w:rPr>
-                <w:b/>
-                <w:bCs/>
-              </w:rPr>
-            </w:pPr>
-            <w:r>
-              <w:rPr>
-                <w:b/>
-                <w:bCs/>
-              </w:rPr>
-              <w:t>D1 (Positif)</w:t>
-            </w:r>
-          </w:p>
-        </w:tc>
-        <w:tc>
-          <w:tcPr>
-            <w:tcW w:w="1585" w:type="dxa"/>
-          </w:tcPr>
-          <w:p>
-            <w:pPr>
-              <w:jc w:val="center"/>
-              <w:rPr>
-                <w:b/>
-                <w:bCs/>
-              </w:rPr>
-            </w:pPr>
-            <w:r>
-              <w:rPr>
-                <w:b/>
-                <w:bCs/>
-              </w:rPr>
-              <w:t>D2 (Positif)</w:t>
-            </w:r>
-          </w:p>
-        </w:tc>
-        <w:tc>
-          <w:tcPr>
-            <w:tcW w:w="1586" w:type="dxa"/>
-          </w:tcPr>
-          <w:p>
-            <w:pPr>
-              <w:jc w:val="center"/>
-              <w:rPr>
-                <w:b/>
-                <w:bCs/>
-              </w:rPr>
-            </w:pPr>
-            <w:r>
-              <w:rPr>
-                <w:b/>
-                <w:bCs/>
-              </w:rPr>
-              <w:t>D3 (Negatif)</w:t>
-            </w:r>
-          </w:p>
-        </w:tc>
-        <w:tc>
-          <w:tcPr>
-            <w:tcW w:w="1586" w:type="dxa"/>
-          </w:tcPr>
-          <w:p>
-            <w:pPr>
-              <w:rPr>
-                <w:b/>
-                <w:bCs/>
-              </w:rPr>
-            </w:pPr>
-            <w:r>
-              <w:rPr>
-                <w:b/>
-                <w:bCs/>
-              </w:rPr>
-              <w:t>U1 (Data Uji)</w:t>
-            </w:r>
-          </w:p>
-        </w:tc>
-      </w:tr>
-      <w:tr>
-        <w:tc>
-          <w:tcPr>
-            <w:tcW w:w="1585" w:type="dxa"/>
-          </w:tcPr>
-          <w:p>
-            <w:pPr>
-              <w:jc w:val="left"/>
-            </w:pPr>
-            <w:r>
-              <w:t>barang</w:t>
-            </w:r>
-          </w:p>
-        </w:tc>
-        <w:tc>
-          <w:tcPr>
-            <w:tcW w:w="1585" w:type="dxa"/>
-          </w:tcPr>
-          <w:p>
-            <w:pPr>
-              <w:jc w:val="left"/>
-            </w:pPr>
-            <w:r>
-              <w:t>0,075</w:t>
-            </w:r>
-          </w:p>
-        </w:tc>
-        <w:tc>
-          <w:tcPr>
-            <w:tcW w:w="1585" w:type="dxa"/>
-          </w:tcPr>
-          <w:p>
-            <w:pPr>
-              <w:jc w:val="left"/>
-            </w:pPr>
-            <w:r>
-              <w:t>0</w:t>
-            </w:r>
-          </w:p>
-        </w:tc>
-        <w:tc>
-          <w:tcPr>
-            <w:tcW w:w="1586" w:type="dxa"/>
-          </w:tcPr>
-          <w:p>
-            <w:pPr>
-              <w:jc w:val="left"/>
-            </w:pPr>
-            <w:r>
-              <w:t>0</w:t>
-            </w:r>
-          </w:p>
-        </w:tc>
-        <w:tc>
-          <w:tcPr>
-            <w:tcW w:w="1586" w:type="dxa"/>
-          </w:tcPr>
-          <w:p>
-            <w:pPr>
-              <w:jc w:val="left"/>
-            </w:pPr>
-            <w:r>
-              <w:t>0,06</w:t>
-            </w:r>
-          </w:p>
-        </w:tc>
-      </w:tr>
-      <w:tr>
-        <w:tc>
-          <w:tcPr>
-            <w:tcW w:w="1585" w:type="dxa"/>
-          </w:tcPr>
-          <w:p>
-            <w:pPr>
-              <w:jc w:val="left"/>
-            </w:pPr>
-            <w:r>
-              <w:t>bagus</w:t>
-            </w:r>
-          </w:p>
-        </w:tc>
-        <w:tc>
-          <w:tcPr>
-            <w:tcW w:w="1585" w:type="dxa"/>
-          </w:tcPr>
-          <w:p>
-            <w:pPr>
-              <w:jc w:val="left"/>
-            </w:pPr>
-            <w:r>
-              <w:t>0,151</w:t>
-            </w:r>
-          </w:p>
-        </w:tc>
-        <w:tc>
-          <w:tcPr>
-            <w:tcW w:w="1585" w:type="dxa"/>
-          </w:tcPr>
-          <w:p>
-            <w:pPr>
-              <w:jc w:val="left"/>
-            </w:pPr>
-            <w:r>
-              <w:t>0</w:t>
-            </w:r>
-          </w:p>
-        </w:tc>
-        <w:tc>
-          <w:tcPr>
-            <w:tcW w:w="1586" w:type="dxa"/>
-          </w:tcPr>
-          <w:p>
-            <w:pPr>
-              <w:jc w:val="left"/>
-            </w:pPr>
-            <w:r>
-              <w:t>0</w:t>
-            </w:r>
-          </w:p>
-        </w:tc>
-        <w:tc>
-          <w:tcPr>
-            <w:tcW w:w="1586" w:type="dxa"/>
-          </w:tcPr>
-          <w:p>
-            <w:pPr>
-              <w:jc w:val="left"/>
-            </w:pPr>
-            <w:r>
-              <w:t>0</w:t>
-            </w:r>
-          </w:p>
-        </w:tc>
-      </w:tr>
-      <w:tr>
-        <w:tc>
-          <w:tcPr>
-            <w:tcW w:w="1585" w:type="dxa"/>
-          </w:tcPr>
-          <w:p>
-            <w:pPr>
-              <w:jc w:val="left"/>
-            </w:pPr>
-            <w:proofErr w:type="spellStart"/>
-            <w:r>
-              <w:t>respon</w:t>
-            </w:r>
-            <w:proofErr w:type="spellEnd"/>
-          </w:p>
-        </w:tc>
-        <w:tc>
-          <w:tcPr>
-            <w:tcW w:w="1585" w:type="dxa"/>
-          </w:tcPr>
-          <w:p>
-            <w:pPr>
-              <w:jc w:val="left"/>
-            </w:pPr>
-            <w:r>
-              <w:t>0,075</w:t>
-            </w:r>
-          </w:p>
-        </w:tc>
-        <w:tc>
-          <w:tcPr>
-            <w:tcW w:w="1585" w:type="dxa"/>
-          </w:tcPr>
-          <w:p>
-            <w:pPr>
-              <w:jc w:val="left"/>
-            </w:pPr>
-            <w:r>
-              <w:t>0</w:t>
-            </w:r>
-          </w:p>
-        </w:tc>
-        <w:tc>
-          <w:tcPr>
-            <w:tcW w:w="1586" w:type="dxa"/>
-          </w:tcPr>
-          <w:p>
-            <w:pPr>
-              <w:jc w:val="left"/>
-            </w:pPr>
-            <w:r>
-              <w:t>0</w:t>
-            </w:r>
-          </w:p>
-        </w:tc>
-        <w:tc>
-          <w:tcPr>
-            <w:tcW w:w="1586" w:type="dxa"/>
-          </w:tcPr>
-          <w:p>
-            <w:pPr>
-              <w:jc w:val="left"/>
-            </w:pPr>
-            <w:r>
-              <w:t>0,06</w:t>
-            </w:r>
-          </w:p>
-        </w:tc>
-      </w:tr>
-      <w:tr>
-        <w:tc>
-          <w:tcPr>
-            <w:tcW w:w="1585" w:type="dxa"/>
-          </w:tcPr>
-          <w:p>
-            <w:pPr>
-              <w:jc w:val="left"/>
-            </w:pPr>
-            <w:r>
-              <w:t>cepat</w:t>
-            </w:r>
-          </w:p>
-        </w:tc>
-        <w:tc>
-          <w:tcPr>
-            <w:tcW w:w="1585" w:type="dxa"/>
-          </w:tcPr>
-          <w:p>
-            <w:pPr>
-              <w:jc w:val="left"/>
-            </w:pPr>
-            <w:r>
-              <w:t>0,151</w:t>
-            </w:r>
-          </w:p>
-        </w:tc>
-        <w:tc>
-          <w:tcPr>
-            <w:tcW w:w="1585" w:type="dxa"/>
-          </w:tcPr>
-          <w:p>
-            <w:pPr>
-              <w:jc w:val="left"/>
-            </w:pPr>
-            <w:r>
-              <w:t>0</w:t>
-            </w:r>
-          </w:p>
-        </w:tc>
-        <w:tc>
-          <w:tcPr>
-            <w:tcW w:w="1586" w:type="dxa"/>
-          </w:tcPr>
-          <w:p>
-            <w:pPr>
-              <w:jc w:val="left"/>
-            </w:pPr>
-            <w:r>
-              <w:t>0</w:t>
-            </w:r>
-          </w:p>
-        </w:tc>
-        <w:tc>
-          <w:tcPr>
-            <w:tcW w:w="1586" w:type="dxa"/>
-          </w:tcPr>
-          <w:p>
-            <w:pPr>
-              <w:jc w:val="left"/>
-            </w:pPr>
-            <w:r>
-              <w:t>0</w:t>
-            </w:r>
-          </w:p>
-        </w:tc>
-      </w:tr>
-      <w:tr>
-        <w:tc>
-          <w:tcPr>
-            <w:tcW w:w="1585" w:type="dxa"/>
-          </w:tcPr>
-          <w:p>
-            <w:pPr>
-              <w:jc w:val="left"/>
-            </w:pPr>
-            <w:r>
-              <w:t>fungsi</w:t>
-            </w:r>
-          </w:p>
-        </w:tc>
-        <w:tc>
-          <w:tcPr>
-            <w:tcW w:w="1585" w:type="dxa"/>
-          </w:tcPr>
-          <w:p>
-            <w:pPr>
-              <w:jc w:val="left"/>
-            </w:pPr>
-            <w:r>
-              <w:t>0</w:t>
-            </w:r>
-          </w:p>
-        </w:tc>
-        <w:tc>
-          <w:tcPr>
-            <w:tcW w:w="1585" w:type="dxa"/>
-          </w:tcPr>
-          <w:p>
-            <w:pPr>
-              <w:jc w:val="left"/>
-            </w:pPr>
-            <w:r>
-              <w:t>0,151</w:t>
-            </w:r>
-          </w:p>
-        </w:tc>
-        <w:tc>
-          <w:tcPr>
-            <w:tcW w:w="1586" w:type="dxa"/>
-          </w:tcPr>
-          <w:p>
-            <w:pPr>
-              <w:jc w:val="left"/>
-            </w:pPr>
-            <w:r>
-              <w:t>0</w:t>
-            </w:r>
-          </w:p>
-        </w:tc>
-        <w:tc>
-          <w:tcPr>
-            <w:tcW w:w="1586" w:type="dxa"/>
-          </w:tcPr>
-          <w:p>
-            <w:pPr>
-              <w:jc w:val="left"/>
-            </w:pPr>
-            <w:r>
-              <w:t>0</w:t>
-            </w:r>
-          </w:p>
-        </w:tc>
-      </w:tr>
-      <w:tr>
-        <w:tc>
-          <w:tcPr>
-            <w:tcW w:w="1585" w:type="dxa"/>
-          </w:tcPr>
-          <w:p>
-            <w:pPr>
-              <w:jc w:val="left"/>
-            </w:pPr>
-            <w:r>
-              <w:t>baik</w:t>
-            </w:r>
-          </w:p>
-        </w:tc>
-        <w:tc>
-          <w:tcPr>
-            <w:tcW w:w="1585" w:type="dxa"/>
-          </w:tcPr>
-          <w:p>
-            <w:pPr>
-              <w:jc w:val="left"/>
-            </w:pPr>
-            <w:r>
-              <w:t>0</w:t>
-            </w:r>
-          </w:p>
-        </w:tc>
-        <w:tc>
-          <w:tcPr>
-            <w:tcW w:w="1585" w:type="dxa"/>
-          </w:tcPr>
-          <w:p>
-            <w:pPr>
-              <w:jc w:val="left"/>
-            </w:pPr>
-            <w:r>
-              <w:t>0,151</w:t>
-            </w:r>
-          </w:p>
-        </w:tc>
-        <w:tc>
-          <w:tcPr>
-            <w:tcW w:w="1586" w:type="dxa"/>
-          </w:tcPr>
-          <w:p>
-            <w:pPr>
-              <w:jc w:val="left"/>
-            </w:pPr>
-            <w:r>
-              <w:t>0</w:t>
-            </w:r>
-          </w:p>
-        </w:tc>
-        <w:tc>
-          <w:tcPr>
-            <w:tcW w:w="1586" w:type="dxa"/>
-          </w:tcPr>
-          <w:p>
-            <w:pPr>
-              <w:jc w:val="left"/>
-            </w:pPr>
-            <w:r>
-              <w:t>0</w:t>
-            </w:r>
-          </w:p>
-        </w:tc>
-      </w:tr>
-      <w:tr>
-        <w:tc>
-          <w:tcPr>
-            <w:tcW w:w="1585" w:type="dxa"/>
-          </w:tcPr>
-          <w:p>
-            <w:pPr>
-              <w:jc w:val="left"/>
-            </w:pPr>
-            <w:proofErr w:type="spellStart"/>
-            <w:r>
-              <w:t>seler</w:t>
-            </w:r>
-            <w:proofErr w:type="spellEnd"/>
-          </w:p>
-        </w:tc>
-        <w:tc>
-          <w:tcPr>
-            <w:tcW w:w="1585" w:type="dxa"/>
-          </w:tcPr>
-          <w:p>
-            <w:pPr>
-              <w:jc w:val="left"/>
-            </w:pPr>
-            <w:r>
-              <w:t>0</w:t>
-            </w:r>
-          </w:p>
-        </w:tc>
-        <w:tc>
-          <w:tcPr>
-            <w:tcW w:w="1585" w:type="dxa"/>
-          </w:tcPr>
-          <w:p>
-            <w:pPr>
-              <w:jc w:val="left"/>
-            </w:pPr>
-            <w:r>
-              <w:t>0,151</w:t>
-            </w:r>
-          </w:p>
-        </w:tc>
-        <w:tc>
-          <w:tcPr>
-            <w:tcW w:w="1586" w:type="dxa"/>
-          </w:tcPr>
-          <w:p>
-            <w:pPr>
-              <w:jc w:val="left"/>
-            </w:pPr>
-            <w:r>
-              <w:t>0</w:t>
-            </w:r>
-          </w:p>
-        </w:tc>
-        <w:tc>
-          <w:tcPr>
-            <w:tcW w:w="1586" w:type="dxa"/>
-          </w:tcPr>
-          <w:p>
-            <w:pPr>
-              <w:jc w:val="left"/>
-            </w:pPr>
-            <w:r>
-              <w:t>0</w:t>
-            </w:r>
-          </w:p>
-        </w:tc>
-      </w:tr>
-      <w:tr>
-        <w:tc>
-          <w:tcPr>
-            <w:tcW w:w="1585" w:type="dxa"/>
-          </w:tcPr>
-          <w:p>
-            <w:pPr>
-              <w:jc w:val="left"/>
-            </w:pPr>
-            <w:r>
-              <w:t>ramah</w:t>
-            </w:r>
-          </w:p>
-        </w:tc>
-        <w:tc>
-          <w:tcPr>
-            <w:tcW w:w="1585" w:type="dxa"/>
-          </w:tcPr>
-          <w:p>
-            <w:pPr>
-              <w:jc w:val="left"/>
-            </w:pPr>
-            <w:r>
-              <w:t>0</w:t>
-            </w:r>
-          </w:p>
-        </w:tc>
-        <w:tc>
-          <w:tcPr>
-            <w:tcW w:w="1585" w:type="dxa"/>
-          </w:tcPr>
-          <w:p>
-            <w:pPr>
-              <w:jc w:val="left"/>
-            </w:pPr>
-            <w:r>
-              <w:t>0,151</w:t>
-            </w:r>
-          </w:p>
-        </w:tc>
-        <w:tc>
-          <w:tcPr>
-            <w:tcW w:w="1586" w:type="dxa"/>
-          </w:tcPr>
-          <w:p>
-            <w:pPr>
-              <w:jc w:val="left"/>
-            </w:pPr>
-            <w:r>
-              <w:t>0</w:t>
-            </w:r>
-          </w:p>
-        </w:tc>
-        <w:tc>
-          <w:tcPr>
-            <w:tcW w:w="1586" w:type="dxa"/>
-          </w:tcPr>
-          <w:p>
-            <w:pPr>
-              <w:jc w:val="left"/>
-            </w:pPr>
-            <w:r>
-              <w:t>0</w:t>
-            </w:r>
-          </w:p>
-        </w:tc>
-      </w:tr>
-      <w:tr>
-        <w:tc>
-          <w:tcPr>
-            <w:tcW w:w="1585" w:type="dxa"/>
-          </w:tcPr>
-          <w:p>
-            <w:pPr>
-              <w:jc w:val="left"/>
-            </w:pPr>
-            <w:r>
-              <w:t>kecewa</w:t>
-            </w:r>
-          </w:p>
-        </w:tc>
-        <w:tc>
-          <w:tcPr>
-            <w:tcW w:w="1585" w:type="dxa"/>
-          </w:tcPr>
-          <w:p>
-            <w:pPr>
-              <w:jc w:val="left"/>
-            </w:pPr>
-            <w:r>
-              <w:t>0</w:t>
-            </w:r>
-          </w:p>
-        </w:tc>
-        <w:tc>
-          <w:tcPr>
-            <w:tcW w:w="1585" w:type="dxa"/>
-          </w:tcPr>
-          <w:p>
-            <w:pPr>
-              <w:jc w:val="left"/>
-            </w:pPr>
-            <w:r>
-              <w:t>0</w:t>
-            </w:r>
-          </w:p>
-        </w:tc>
-        <w:tc>
-          <w:tcPr>
-            <w:tcW w:w="1586" w:type="dxa"/>
-          </w:tcPr>
-          <w:p>
-            <w:pPr>
-              <w:jc w:val="left"/>
-            </w:pPr>
-            <w:r>
-              <w:t>0,1</w:t>
-            </w:r>
-          </w:p>
-        </w:tc>
-        <w:tc>
-          <w:tcPr>
-            <w:tcW w:w="1586" w:type="dxa"/>
-          </w:tcPr>
-          <w:p>
-            <w:pPr>
-              <w:jc w:val="left"/>
-            </w:pPr>
-            <w:r>
-              <w:t>0,06</w:t>
-            </w:r>
-          </w:p>
-        </w:tc>
-      </w:tr>
-      <w:tr>
-        <w:tc>
-          <w:tcPr>
-            <w:tcW w:w="1585" w:type="dxa"/>
-          </w:tcPr>
-          <w:p>
-            <w:pPr>
-              <w:jc w:val="left"/>
-            </w:pPr>
-            <w:proofErr w:type="spellStart"/>
-            <w:r>
-              <w:t>scroll</w:t>
-            </w:r>
-            <w:proofErr w:type="spellEnd"/>
-          </w:p>
-        </w:tc>
-        <w:tc>
-          <w:tcPr>
-            <w:tcW w:w="1585" w:type="dxa"/>
-          </w:tcPr>
-          <w:p>
-            <w:pPr>
-              <w:jc w:val="left"/>
-            </w:pPr>
-            <w:r>
-              <w:t>0</w:t>
-            </w:r>
-          </w:p>
-        </w:tc>
-        <w:tc>
-          <w:tcPr>
-            <w:tcW w:w="1585" w:type="dxa"/>
-          </w:tcPr>
-          <w:p>
-            <w:pPr>
-              <w:jc w:val="left"/>
-            </w:pPr>
-            <w:r>
-              <w:t>0</w:t>
-            </w:r>
-          </w:p>
-        </w:tc>
-        <w:tc>
-          <w:tcPr>
-            <w:tcW w:w="1586" w:type="dxa"/>
-          </w:tcPr>
-          <w:p>
-            <w:pPr>
-              <w:jc w:val="left"/>
-            </w:pPr>
-            <w:r>
-              <w:t>0,2</w:t>
-            </w:r>
-          </w:p>
-        </w:tc>
-        <w:tc>
-          <w:tcPr>
-            <w:tcW w:w="1586" w:type="dxa"/>
-          </w:tcPr>
-          <w:p>
-            <w:pPr>
-              <w:jc w:val="left"/>
-            </w:pPr>
-            <w:r>
-              <w:t>0</w:t>
-            </w:r>
-          </w:p>
-        </w:tc>
-      </w:tr>
-      <w:tr>
-        <w:tc>
-          <w:tcPr>
-            <w:tcW w:w="1585" w:type="dxa"/>
-          </w:tcPr>
-          <w:p>
-            <w:pPr>
-              <w:jc w:val="left"/>
-            </w:pPr>
-            <w:r>
-              <w:t>rusak</w:t>
-            </w:r>
-          </w:p>
-        </w:tc>
-        <w:tc>
-          <w:tcPr>
-            <w:tcW w:w="1585" w:type="dxa"/>
-          </w:tcPr>
-          <w:p>
-            <w:pPr>
-              <w:jc w:val="left"/>
-            </w:pPr>
-            <w:r>
-              <w:t>0</w:t>
-            </w:r>
-          </w:p>
-        </w:tc>
-        <w:tc>
-          <w:tcPr>
-            <w:tcW w:w="1585" w:type="dxa"/>
-          </w:tcPr>
-          <w:p>
-            <w:pPr>
-              <w:jc w:val="left"/>
-            </w:pPr>
-            <w:r>
-              <w:t>0</w:t>
-            </w:r>
-          </w:p>
-        </w:tc>
-        <w:tc>
-          <w:tcPr>
-            <w:tcW w:w="1586" w:type="dxa"/>
-          </w:tcPr>
-          <w:p>
-            <w:pPr>
-              <w:jc w:val="left"/>
-            </w:pPr>
-            <w:r>
-              <w:t>0,1</w:t>
-            </w:r>
-          </w:p>
-        </w:tc>
-        <w:tc>
-          <w:tcPr>
-            <w:tcW w:w="1586" w:type="dxa"/>
-          </w:tcPr>
-          <w:p>
-            <w:pPr>
-              <w:jc w:val="left"/>
-            </w:pPr>
-            <w:r>
-              <w:t>0,06</w:t>
-            </w:r>
-          </w:p>
-        </w:tc>
-      </w:tr>
-      <w:tr>
-        <w:tc>
-          <w:tcPr>
-            <w:tcW w:w="1585" w:type="dxa"/>
-          </w:tcPr>
-          <w:p>
-            <w:pPr>
-              <w:jc w:val="left"/>
-            </w:pPr>
-            <w:r>
-              <w:t>lambat</w:t>
-            </w:r>
-          </w:p>
-        </w:tc>
-        <w:tc>
-          <w:tcPr>
-            <w:tcW w:w="1585" w:type="dxa"/>
-          </w:tcPr>
-          <w:p>
-            <w:pPr>
-              <w:jc w:val="left"/>
-            </w:pPr>
-            <w:r>
-              <w:t>0</w:t>
-            </w:r>
-          </w:p>
-        </w:tc>
-        <w:tc>
-          <w:tcPr>
-            <w:tcW w:w="1585" w:type="dxa"/>
-          </w:tcPr>
-          <w:p>
-            <w:pPr>
-              <w:jc w:val="left"/>
-            </w:pPr>
-            <w:r>
-              <w:t>0</w:t>
-            </w:r>
-          </w:p>
-        </w:tc>
-        <w:tc>
-          <w:tcPr>
-            <w:tcW w:w="1586" w:type="dxa"/>
-          </w:tcPr>
-          <w:p>
-            <w:pPr>
-              <w:jc w:val="left"/>
-            </w:pPr>
-            <w:r>
-              <w:t>0</w:t>
-            </w:r>
-          </w:p>
-        </w:tc>
-        <w:tc>
-          <w:tcPr>
-            <w:tcW w:w="1586" w:type="dxa"/>
-          </w:tcPr>
-          <w:p>
-            <w:pPr>
-              <w:jc w:val="left"/>
-            </w:pPr>
-            <w:r>
-              <w:t>0,12</w:t>
-            </w:r>
-          </w:p>
-        </w:tc>
-      </w:tr>
-    </w:tbl>
-    <w:p>
-      <w:r>
-        <w:rPr>
-          <w:color w:val="EE0000"/>
-        </w:rPr>
-        <w:t xml:space="preserve">Matriks TF-IDF Data Latih dan Data </w:t>
-      </w:r>
-      <w:r>
-        <w:t>Uji</w:t>
-      </w:r>
-    </w:p>
-    <w:p>
-      <w:r>
-        <w:lastRenderedPageBreak/>
-        <w:t xml:space="preserve">Perhitungan </w:t>
-      </w:r>
-      <w:proofErr w:type="spellStart"/>
-      <w:r>
-        <w:t>Euclidean</w:t>
-      </w:r>
-      <w:proofErr w:type="spellEnd"/>
-      <w:r>
-        <w:t xml:space="preserve"> </w:t>
-      </w:r>
-      <w:proofErr w:type="spellStart"/>
-      <w:r>
-        <w:t>Distance</w:t>
-      </w:r>
-      <w:proofErr w:type="spellEnd"/>
-    </w:p>
-    <w:tbl>
-      <w:tblPr>
-        <w:tblStyle w:val="TableGrid"/>
-        <w:tblW w:w="0" w:type="auto"/>
-        <w:tblLook w:val="04A0" w:firstRow="1" w:lastRow="0" w:firstColumn="1" w:lastColumn="0" w:noHBand="0" w:noVBand="1"/>
-      </w:tblPr>
-      <w:tblGrid>
-        <w:gridCol w:w="1555"/>
-        <w:gridCol w:w="3729"/>
-        <w:gridCol w:w="2643"/>
-      </w:tblGrid>
-      <w:tr>
-        <w:tc>
-          <w:tcPr>
-            <w:tcW w:w="1555" w:type="dxa"/>
-          </w:tcPr>
-          <w:p>
-            <w:pPr>
-              <w:jc w:val="center"/>
-              <w:rPr>
-                <w:b/>
-                <w:bCs/>
-              </w:rPr>
-            </w:pPr>
-            <w:r>
-              <w:rPr>
-                <w:b/>
-                <w:bCs/>
-              </w:rPr>
-              <w:t>Data Latih</w:t>
-            </w:r>
-          </w:p>
-        </w:tc>
-        <w:tc>
-          <w:tcPr>
-            <w:tcW w:w="3729" w:type="dxa"/>
-          </w:tcPr>
-          <w:p>
-            <w:pPr>
-              <w:jc w:val="center"/>
-              <w:rPr>
-                <w:b/>
-                <w:bCs/>
-              </w:rPr>
-            </w:pPr>
-            <w:r>
-              <w:rPr>
-                <w:b/>
-                <w:bCs/>
-              </w:rPr>
-              <w:t>Perhitungan</w:t>
-            </w:r>
-          </w:p>
-        </w:tc>
-        <w:tc>
-          <w:tcPr>
-            <w:tcW w:w="2643" w:type="dxa"/>
-          </w:tcPr>
-          <w:p>
-            <w:pPr>
-              <w:jc w:val="center"/>
-              <w:rPr>
-                <w:b/>
-                <w:bCs/>
-              </w:rPr>
-            </w:pPr>
-            <w:r>
-              <w:rPr>
-                <w:b/>
-                <w:bCs/>
-              </w:rPr>
-              <w:t>Hasil Jarak</w:t>
-            </w:r>
-          </w:p>
-        </w:tc>
-      </w:tr>
-      <w:tr>
-        <w:tc>
-          <w:tcPr>
-            <w:tcW w:w="1555" w:type="dxa"/>
-          </w:tcPr>
-          <w:p>
-            <w:r>
-              <w:t>D1</w:t>
-            </w:r>
-          </w:p>
-        </w:tc>
-        <w:tc>
-          <w:tcPr>
-            <w:tcW w:w="3729" w:type="dxa"/>
-            <w:vAlign w:val="center"/>
-          </w:tcPr>
-          <w:p>
-            <w:pPr>
-              <w:jc w:val="left"/>
-            </w:pPr>
-            <m:oMath>
-              <m:r>
-                <w:rPr>
-                  <w:rFonts w:ascii="Cambria Math" w:hAnsi="Cambria Math"/>
-                </w:rPr>
-                <m:t>d</m:t>
-              </m:r>
-              <m:d>
-                <m:dPr>
-                  <m:ctrlPr>
-                    <w:rPr>
-                      <w:rFonts w:ascii="Cambria Math" w:hAnsi="Cambria Math"/>
-                      <w:i/>
-                    </w:rPr>
-                  </m:ctrlPr>
-                </m:dPr>
-                <m:e>
-                  <m:r>
-                    <w:rPr>
-                      <w:rFonts w:ascii="Cambria Math" w:hAnsi="Cambria Math"/>
-                    </w:rPr>
-                    <m:t>U1,D1</m:t>
-                  </m:r>
-                </m:e>
-              </m:d>
-              <m:r>
-                <w:rPr>
-                  <w:rFonts w:ascii="Cambria Math" w:hAnsi="Cambria Math"/>
-                </w:rPr>
-                <m:t>=</m:t>
-              </m:r>
-              <m:rad>
-                <m:radPr>
-                  <m:degHide m:val="1"/>
-                  <m:ctrlPr>
-                    <w:rPr>
-                      <w:rFonts w:ascii="Cambria Math" w:hAnsi="Cambria Math"/>
-                      <w:i/>
-                    </w:rPr>
-                  </m:ctrlPr>
-                </m:radPr>
-                <m:deg/>
-                <m:e>
-                  <m:nary>
-                    <m:naryPr>
-                      <m:chr m:val="∑"/>
-                      <m:limLoc m:val="undOvr"/>
-                      <m:subHide m:val="1"/>
-                      <m:supHide m:val="1"/>
-                      <m:ctrlPr>
-                        <w:rPr>
-                          <w:rFonts w:ascii="Cambria Math" w:hAnsi="Cambria Math"/>
-                          <w:i/>
-                        </w:rPr>
-                      </m:ctrlPr>
-                    </m:naryPr>
-                    <m:sub/>
-                    <m:sup/>
-                    <m:e>
-                      <m:sSup>
-                        <m:sSupPr>
-                          <m:ctrlPr>
-                            <w:rPr>
-                              <w:rFonts w:ascii="Cambria Math" w:hAnsi="Cambria Math"/>
-                              <w:i/>
-                            </w:rPr>
-                          </m:ctrlPr>
-                        </m:sSupPr>
-                        <m:e>
-                          <m:sSub>
-                            <m:sSubPr>
-                              <m:ctrlPr>
-                                <w:rPr>
-                                  <w:rFonts w:ascii="Cambria Math" w:hAnsi="Cambria Math"/>
-                                  <w:i/>
-                                </w:rPr>
-                              </m:ctrlPr>
-                            </m:sSubPr>
-                            <m:e>
-                              <m:r>
-                                <w:rPr>
-                                  <w:rFonts w:ascii="Cambria Math" w:hAnsi="Cambria Math"/>
-                                </w:rPr>
-                                <m:t>U1</m:t>
-                              </m:r>
-                            </m:e>
-                            <m:sub>
-                              <m:r>
-                                <w:rPr>
-                                  <w:rFonts w:ascii="Cambria Math" w:hAnsi="Cambria Math"/>
-                                </w:rPr>
-                                <m:t>i</m:t>
-                              </m:r>
-                            </m:sub>
-                          </m:sSub>
-                          <m:sSub>
-                            <m:sSubPr>
-                              <m:ctrlPr>
-                                <w:rPr>
-                                  <w:rFonts w:ascii="Cambria Math" w:hAnsi="Cambria Math"/>
-                                  <w:i/>
-                                </w:rPr>
-                              </m:ctrlPr>
-                            </m:sSubPr>
-                            <m:e>
-                              <m:r>
-                                <w:rPr>
-                                  <w:rFonts w:ascii="Cambria Math" w:hAnsi="Cambria Math"/>
-                                </w:rPr>
-                                <m:t>D1</m:t>
-                              </m:r>
-                            </m:e>
-                            <m:sub>
-                              <m:r>
-                                <w:rPr>
-                                  <w:rFonts w:ascii="Cambria Math" w:hAnsi="Cambria Math"/>
-                                </w:rPr>
-                                <m:t>i</m:t>
-                              </m:r>
-                            </m:sub>
-                          </m:sSub>
-                        </m:e>
-                        <m:sup>
-                          <m:r>
-                            <w:rPr>
-                              <w:rFonts w:ascii="Cambria Math" w:hAnsi="Cambria Math"/>
-                            </w:rPr>
-                            <m:t>2</m:t>
-                          </m:r>
-                        </m:sup>
-                      </m:sSup>
-                    </m:e>
-                  </m:nary>
-                </m:e>
-              </m:rad>
-            </m:oMath>
-            <w:r>
-              <w:t xml:space="preserve"> </w:t>
-            </w:r>
-          </w:p>
-        </w:tc>
-        <w:tc>
-          <w:tcPr>
-            <w:tcW w:w="2643" w:type="dxa"/>
-          </w:tcPr>
-          <w:p>
-            <w:r>
-              <w:t>0,2601</w:t>
-            </w:r>
-          </w:p>
-        </w:tc>
-      </w:tr>
-      <w:tr>
-        <w:tc>
-          <w:tcPr>
-            <w:tcW w:w="1555" w:type="dxa"/>
-          </w:tcPr>
-          <w:p>
-            <w:r>
-              <w:t>D2</w:t>
-            </w:r>
-          </w:p>
-        </w:tc>
-        <w:tc>
-          <w:tcPr>
-            <w:tcW w:w="3729" w:type="dxa"/>
-          </w:tcPr>
-          <w:p>
-            <m:oMath>
-              <m:r>
-                <w:rPr>
-                  <w:rFonts w:ascii="Cambria Math" w:hAnsi="Cambria Math"/>
-                </w:rPr>
-                <m:t>d</m:t>
-              </m:r>
-              <m:d>
-                <m:dPr>
-                  <m:ctrlPr>
-                    <w:rPr>
-                      <w:rFonts w:ascii="Cambria Math" w:hAnsi="Cambria Math"/>
-                      <w:i/>
-                    </w:rPr>
-                  </m:ctrlPr>
-                </m:dPr>
-                <m:e>
-                  <m:r>
-                    <w:rPr>
-                      <w:rFonts w:ascii="Cambria Math" w:hAnsi="Cambria Math"/>
-                    </w:rPr>
-                    <m:t>U1,D2</m:t>
-                  </m:r>
-                </m:e>
-              </m:d>
-              <m:r>
-                <w:rPr>
-                  <w:rFonts w:ascii="Cambria Math" w:hAnsi="Cambria Math"/>
-                </w:rPr>
-                <m:t>=</m:t>
-              </m:r>
-              <m:rad>
-                <m:radPr>
-                  <m:degHide m:val="1"/>
-                  <m:ctrlPr>
-                    <w:rPr>
-                      <w:rFonts w:ascii="Cambria Math" w:hAnsi="Cambria Math"/>
-                      <w:i/>
-                    </w:rPr>
-                  </m:ctrlPr>
-                </m:radPr>
-                <m:deg/>
-                <m:e>
-                  <m:nary>
-                    <m:naryPr>
-                      <m:chr m:val="∑"/>
-                      <m:limLoc m:val="undOvr"/>
-                      <m:subHide m:val="1"/>
-                      <m:supHide m:val="1"/>
-                      <m:ctrlPr>
-                        <w:rPr>
-                          <w:rFonts w:ascii="Cambria Math" w:hAnsi="Cambria Math"/>
-                          <w:i/>
-                        </w:rPr>
-                      </m:ctrlPr>
-                    </m:naryPr>
-                    <m:sub/>
-                    <m:sup/>
-                    <m:e>
-                      <m:sSup>
-                        <m:sSupPr>
-                          <m:ctrlPr>
-                            <w:rPr>
-                              <w:rFonts w:ascii="Cambria Math" w:hAnsi="Cambria Math"/>
-                              <w:i/>
-                            </w:rPr>
-                          </m:ctrlPr>
-                        </m:sSupPr>
-                        <m:e>
-                          <m:sSub>
-                            <m:sSubPr>
-                              <m:ctrlPr>
-                                <w:rPr>
-                                  <w:rFonts w:ascii="Cambria Math" w:hAnsi="Cambria Math"/>
-                                  <w:i/>
-                                </w:rPr>
-                              </m:ctrlPr>
-                            </m:sSubPr>
-                            <m:e>
-                              <m:r>
-                                <w:rPr>
-                                  <w:rFonts w:ascii="Cambria Math" w:hAnsi="Cambria Math"/>
-                                </w:rPr>
-                                <m:t>U1</m:t>
-                              </m:r>
-                            </m:e>
-                            <m:sub>
-                              <m:r>
-                                <w:rPr>
-                                  <w:rFonts w:ascii="Cambria Math" w:hAnsi="Cambria Math"/>
-                                </w:rPr>
-                                <m:t>i</m:t>
-                              </m:r>
-                            </m:sub>
-                          </m:sSub>
-                          <m:sSub>
-                            <m:sSubPr>
-                              <m:ctrlPr>
-                                <w:rPr>
-                                  <w:rFonts w:ascii="Cambria Math" w:hAnsi="Cambria Math"/>
-                                  <w:i/>
-                                </w:rPr>
-                              </m:ctrlPr>
-                            </m:sSubPr>
-                            <m:e>
-                              <m:r>
-                                <w:rPr>
-                                  <w:rFonts w:ascii="Cambria Math" w:hAnsi="Cambria Math"/>
-                                </w:rPr>
-                                <m:t>D2</m:t>
-                              </m:r>
-                            </m:e>
-                            <m:sub>
-                              <m:r>
-                                <w:rPr>
-                                  <w:rFonts w:ascii="Cambria Math" w:hAnsi="Cambria Math"/>
-                                </w:rPr>
-                                <m:t>i</m:t>
-                              </m:r>
-                            </m:sub>
-                          </m:sSub>
-                        </m:e>
-                        <m:sup>
-                          <m:r>
-                            <w:rPr>
-                              <w:rFonts w:ascii="Cambria Math" w:hAnsi="Cambria Math"/>
-                            </w:rPr>
-                            <m:t>2</m:t>
-                          </m:r>
-                        </m:sup>
-                      </m:sSup>
-                    </m:e>
-                  </m:nary>
-                </m:e>
-              </m:rad>
-            </m:oMath>
-            <w:r>
-              <w:t xml:space="preserve"> </w:t>
-            </w:r>
-          </w:p>
-        </w:tc>
-        <w:tc>
-          <w:tcPr>
-            <w:tcW w:w="2643" w:type="dxa"/>
-          </w:tcPr>
-          <w:p>
-            <w:r>
-              <w:t>0,3464</w:t>
-            </w:r>
-          </w:p>
-        </w:tc>
-      </w:tr>
-      <w:tr>
-        <w:tc>
-          <w:tcPr>
-            <w:tcW w:w="1555" w:type="dxa"/>
-          </w:tcPr>
-          <w:p>
-            <w:r>
-              <w:t>D3</w:t>
-            </w:r>
-          </w:p>
-        </w:tc>
-        <w:tc>
-          <w:tcPr>
-            <w:tcW w:w="3729" w:type="dxa"/>
-          </w:tcPr>
-          <w:p>
-            <m:oMath>
-              <m:r>
-                <w:rPr>
-                  <w:rFonts w:ascii="Cambria Math" w:hAnsi="Cambria Math"/>
-                </w:rPr>
-                <m:t>d</m:t>
-              </m:r>
-              <m:d>
-                <m:dPr>
-                  <m:ctrlPr>
-                    <w:rPr>
-                      <w:rFonts w:ascii="Cambria Math" w:hAnsi="Cambria Math"/>
-                      <w:i/>
-                    </w:rPr>
-                  </m:ctrlPr>
-                </m:dPr>
-                <m:e>
-                  <m:r>
-                    <w:rPr>
-                      <w:rFonts w:ascii="Cambria Math" w:hAnsi="Cambria Math"/>
-                    </w:rPr>
-                    <m:t>U1,D3</m:t>
-                  </m:r>
-                </m:e>
-              </m:d>
-              <m:r>
-                <w:rPr>
-                  <w:rFonts w:ascii="Cambria Math" w:hAnsi="Cambria Math"/>
-                </w:rPr>
-                <m:t>=</m:t>
-              </m:r>
-              <m:rad>
-                <m:radPr>
-                  <m:degHide m:val="1"/>
-                  <m:ctrlPr>
-                    <w:rPr>
-                      <w:rFonts w:ascii="Cambria Math" w:hAnsi="Cambria Math"/>
-                      <w:i/>
-                    </w:rPr>
-                  </m:ctrlPr>
-                </m:radPr>
-                <m:deg/>
-                <m:e>
-                  <m:nary>
-                    <m:naryPr>
-                      <m:chr m:val="∑"/>
-                      <m:limLoc m:val="undOvr"/>
-                      <m:subHide m:val="1"/>
-                      <m:supHide m:val="1"/>
-                      <m:ctrlPr>
-                        <w:rPr>
-                          <w:rFonts w:ascii="Cambria Math" w:hAnsi="Cambria Math"/>
-                          <w:i/>
-                        </w:rPr>
-                      </m:ctrlPr>
-                    </m:naryPr>
-                    <m:sub/>
-                    <m:sup/>
-                    <m:e>
-                      <m:sSup>
-                        <m:sSupPr>
-                          <m:ctrlPr>
-                            <w:rPr>
-                              <w:rFonts w:ascii="Cambria Math" w:hAnsi="Cambria Math"/>
-                              <w:i/>
-                            </w:rPr>
-                          </m:ctrlPr>
-                        </m:sSupPr>
-                        <m:e>
-                          <m:sSub>
-                            <m:sSubPr>
-                              <m:ctrlPr>
-                                <w:rPr>
-                                  <w:rFonts w:ascii="Cambria Math" w:hAnsi="Cambria Math"/>
-                                  <w:i/>
-                                </w:rPr>
-                              </m:ctrlPr>
-                            </m:sSubPr>
-                            <m:e>
-                              <m:r>
-                                <w:rPr>
-                                  <w:rFonts w:ascii="Cambria Math" w:hAnsi="Cambria Math"/>
-                                </w:rPr>
-                                <m:t>U1</m:t>
-                              </m:r>
-                            </m:e>
-                            <m:sub>
-                              <m:r>
-                                <w:rPr>
-                                  <w:rFonts w:ascii="Cambria Math" w:hAnsi="Cambria Math"/>
-                                </w:rPr>
-                                <m:t>i</m:t>
-                              </m:r>
-                            </m:sub>
-                          </m:sSub>
-                          <m:sSub>
-                            <m:sSubPr>
-                              <m:ctrlPr>
-                                <w:rPr>
-                                  <w:rFonts w:ascii="Cambria Math" w:hAnsi="Cambria Math"/>
-                                  <w:i/>
-                                </w:rPr>
-                              </m:ctrlPr>
-                            </m:sSubPr>
-                            <m:e>
-                              <m:r>
-                                <w:rPr>
-                                  <w:rFonts w:ascii="Cambria Math" w:hAnsi="Cambria Math"/>
-                                </w:rPr>
-                                <m:t>D3</m:t>
-                              </m:r>
-                            </m:e>
-                            <m:sub>
-                              <m:r>
-                                <w:rPr>
-                                  <w:rFonts w:ascii="Cambria Math" w:hAnsi="Cambria Math"/>
-                                </w:rPr>
-                                <m:t>i</m:t>
-                              </m:r>
-                            </m:sub>
-                          </m:sSub>
-                        </m:e>
-                        <m:sup>
-                          <m:r>
-                            <w:rPr>
-                              <w:rFonts w:ascii="Cambria Math" w:hAnsi="Cambria Math"/>
-                            </w:rPr>
-                            <m:t>2</m:t>
-                          </m:r>
-                        </m:sup>
-                      </m:sSup>
-                    </m:e>
-                  </m:nary>
-                </m:e>
-              </m:rad>
-            </m:oMath>
-            <w:r>
-              <w:t xml:space="preserve"> </w:t>
-            </w:r>
-          </w:p>
-        </w:tc>
-        <w:tc>
-          <w:tcPr>
-            <w:tcW w:w="2643" w:type="dxa"/>
-          </w:tcPr>
-          <w:p>
-            <w:r>
-              <w:t>0,2546</w:t>
-            </w:r>
-          </w:p>
-        </w:tc>
-      </w:tr>
-    </w:tbl>
-    <w:p>
-      <w:r>
-        <w:t>Has</w:t>
-      </w:r>
-      <w:r>
-        <w:rPr>
-          <w:color w:val="EE0000"/>
-        </w:rPr>
-        <w:t xml:space="preserve">il Perhitungan </w:t>
-      </w:r>
-      <w:proofErr w:type="spellStart"/>
-      <w:r>
-        <w:t>Euclidean</w:t>
-      </w:r>
-      <w:proofErr w:type="spellEnd"/>
-      <w:r>
-        <w:t xml:space="preserve"> </w:t>
-      </w:r>
-      <w:proofErr w:type="spellStart"/>
-      <w:r>
-        <w:t>Distance</w:t>
-      </w:r>
-      <w:proofErr w:type="spellEnd"/>
-    </w:p>
-    <w:tbl>
-      <w:tblPr>
-        <w:tblStyle w:val="TableGrid"/>
-        <w:tblW w:w="0" w:type="auto"/>
-        <w:tblLook w:val="04A0" w:firstRow="1" w:lastRow="0" w:firstColumn="1" w:lastColumn="0" w:noHBand="0" w:noVBand="1"/>
-      </w:tblPr>
-      <w:tblGrid>
-        <w:gridCol w:w="1555"/>
-        <w:gridCol w:w="2408"/>
-        <w:gridCol w:w="1982"/>
-        <w:gridCol w:w="1982"/>
-      </w:tblGrid>
-      <w:tr>
-        <w:tc>
-          <w:tcPr>
-            <w:tcW w:w="1555" w:type="dxa"/>
-          </w:tcPr>
-          <w:p>
-            <w:pPr>
-              <w:jc w:val="center"/>
-              <w:rPr>
-                <w:b/>
-                <w:bCs/>
-              </w:rPr>
-            </w:pPr>
-            <w:r>
-              <w:rPr>
-                <w:b/>
-                <w:bCs/>
-              </w:rPr>
-              <w:t>Data Latih</w:t>
-            </w:r>
-          </w:p>
-        </w:tc>
-        <w:tc>
-          <w:tcPr>
-            <w:tcW w:w="2408" w:type="dxa"/>
-          </w:tcPr>
-          <w:p>
-            <w:pPr>
-              <w:jc w:val="center"/>
-              <w:rPr>
-                <w:b/>
-                <w:bCs/>
-              </w:rPr>
-            </w:pPr>
-            <w:proofErr w:type="spellStart"/>
-            <w:r>
-              <w:rPr>
-                <w:b/>
-                <w:bCs/>
-              </w:rPr>
-              <w:t>Cosine</w:t>
-            </w:r>
-            <w:proofErr w:type="spellEnd"/>
-            <w:r>
-              <w:rPr>
-                <w:b/>
-                <w:bCs/>
-              </w:rPr>
-              <w:t xml:space="preserve"> </w:t>
-            </w:r>
-            <w:proofErr w:type="spellStart"/>
-            <w:r>
-              <w:rPr>
-                <w:b/>
-                <w:bCs/>
-              </w:rPr>
-              <w:t>Similarity</w:t>
-            </w:r>
-            <w:proofErr w:type="spellEnd"/>
-            <w:r>
-              <w:rPr>
-                <w:b/>
-                <w:bCs/>
-              </w:rPr>
-              <w:t xml:space="preserve"> (U1, X)</w:t>
-            </w:r>
-          </w:p>
-        </w:tc>
-        <w:tc>
-          <w:tcPr>
-            <w:tcW w:w="1982" w:type="dxa"/>
-          </w:tcPr>
-          <w:p>
-            <w:pPr>
-              <w:jc w:val="center"/>
-              <w:rPr>
-                <w:b/>
-                <w:bCs/>
-              </w:rPr>
-            </w:pPr>
-            <w:r>
-              <w:rPr>
-                <w:b/>
-                <w:bCs/>
-              </w:rPr>
-              <w:t xml:space="preserve">Perhitungan </w:t>
-            </w:r>
-            <w:proofErr w:type="spellStart"/>
-            <w:r>
-              <w:rPr>
-                <w:b/>
-                <w:bCs/>
-              </w:rPr>
-              <w:t>Cosine</w:t>
-            </w:r>
-            <w:proofErr w:type="spellEnd"/>
-            <w:r>
-              <w:rPr>
-                <w:b/>
-                <w:bCs/>
-              </w:rPr>
-              <w:t xml:space="preserve"> </w:t>
-            </w:r>
-            <w:proofErr w:type="spellStart"/>
-            <w:r>
-              <w:rPr>
-                <w:b/>
-                <w:bCs/>
-              </w:rPr>
-              <w:t>Distance</w:t>
-            </w:r>
-            <w:proofErr w:type="spellEnd"/>
-          </w:p>
-        </w:tc>
-        <w:tc>
-          <w:tcPr>
-            <w:tcW w:w="1982" w:type="dxa"/>
-          </w:tcPr>
-          <w:p>
-            <w:pPr>
-              <w:jc w:val="center"/>
-              <w:rPr>
-                <w:b/>
-                <w:bCs/>
-              </w:rPr>
-            </w:pPr>
-            <w:r>
-              <w:rPr>
-                <w:b/>
-                <w:bCs/>
-              </w:rPr>
-              <w:t xml:space="preserve">Hasil </w:t>
-            </w:r>
-            <w:proofErr w:type="spellStart"/>
-            <w:r>
-              <w:rPr>
-                <w:b/>
-                <w:bCs/>
-              </w:rPr>
-              <w:t>Cosine</w:t>
-            </w:r>
-            <w:proofErr w:type="spellEnd"/>
-            <w:r>
-              <w:rPr>
-                <w:b/>
-                <w:bCs/>
-              </w:rPr>
-              <w:t xml:space="preserve"> </w:t>
-            </w:r>
-            <w:proofErr w:type="spellStart"/>
-            <w:r>
-              <w:rPr>
-                <w:b/>
-                <w:bCs/>
-              </w:rPr>
-              <w:t>Distance</w:t>
-            </w:r>
-            <w:proofErr w:type="spellEnd"/>
-          </w:p>
-        </w:tc>
-      </w:tr>
-      <w:tr>
-        <w:tc>
-          <w:tcPr>
-            <w:tcW w:w="1555" w:type="dxa"/>
-          </w:tcPr>
-          <w:p>
-            <w:r>
-              <w:t>D1</w:t>
-            </w:r>
-          </w:p>
-        </w:tc>
-        <w:tc>
-          <w:tcPr>
-            <w:tcW w:w="2408" w:type="dxa"/>
-          </w:tcPr>
-          <w:p>
-            <w:r>
-              <w:t>0,2224</w:t>
-            </w:r>
-          </w:p>
-        </w:tc>
-        <w:tc>
-          <w:tcPr>
-            <w:tcW w:w="1982" w:type="dxa"/>
-          </w:tcPr>
-          <w:p>
-            <w:r>
-              <w:t>1 − 0,2224</w:t>
-            </w:r>
-          </w:p>
-        </w:tc>
-        <w:tc>
-          <w:tcPr>
-            <w:tcW w:w="1982" w:type="dxa"/>
-          </w:tcPr>
-          <w:p>
-            <w:r>
-              <w:t>0,7776</w:t>
-            </w:r>
-          </w:p>
-        </w:tc>
-      </w:tr>
-      <w:tr>
-        <w:tc>
-          <w:tcPr>
-            <w:tcW w:w="1555" w:type="dxa"/>
-          </w:tcPr>
-          <w:p>
-            <w:r>
-              <w:t>D2</w:t>
-            </w:r>
-          </w:p>
-        </w:tc>
-        <w:tc>
-          <w:tcPr>
-            <w:tcW w:w="2408" w:type="dxa"/>
-          </w:tcPr>
-          <w:p>
-            <w:r>
-              <w:t>0,0000</w:t>
-            </w:r>
-          </w:p>
-        </w:tc>
-        <w:tc>
-          <w:tcPr>
-            <w:tcW w:w="1982" w:type="dxa"/>
-          </w:tcPr>
-          <w:p>
-            <w:r>
-              <w:t>1 − 0,0000</w:t>
-            </w:r>
-          </w:p>
-        </w:tc>
-        <w:tc>
-          <w:tcPr>
-            <w:tcW w:w="1982" w:type="dxa"/>
-          </w:tcPr>
-          <w:p>
-            <w:r>
-              <w:t>1,0000</w:t>
-            </w:r>
-          </w:p>
-        </w:tc>
-      </w:tr>
-      <w:tr>
-        <w:tc>
-          <w:tcPr>
-            <w:tcW w:w="1555" w:type="dxa"/>
-          </w:tcPr>
-          <w:p>
-            <w:r>
-              <w:t>D3</w:t>
-            </w:r>
-          </w:p>
-        </w:tc>
-        <w:tc>
-          <w:tcPr>
-            <w:tcW w:w="2408" w:type="dxa"/>
-          </w:tcPr>
-          <w:p>
-            <w:r>
-              <w:t>0,2887</w:t>
-            </w:r>
-          </w:p>
-        </w:tc>
-        <w:tc>
-          <w:tcPr>
-            <w:tcW w:w="1982" w:type="dxa"/>
-          </w:tcPr>
-          <w:p>
-            <w:r>
-              <w:t>1 − 0,2887</w:t>
-            </w:r>
-          </w:p>
-        </w:tc>
-        <w:tc>
-          <w:tcPr>
-            <w:tcW w:w="1982" w:type="dxa"/>
-          </w:tcPr>
-          <w:p>
-            <w:r>
-              <w:t>0,7113</w:t>
-            </w:r>
-          </w:p>
-        </w:tc>
-      </w:tr>
-    </w:tbl>
-    <w:p>
-      <w:r>
-        <w:t>Tabel II.10 H</w:t>
-      </w:r>
-      <w:r>
-        <w:rPr>
-          <w:color w:val="EE0000"/>
-        </w:rPr>
-        <w:t xml:space="preserve">asil Perhitungan </w:t>
-      </w:r>
-      <w:proofErr w:type="spellStart"/>
-      <w:r>
-        <w:t>Cosine</w:t>
-      </w:r>
-      <w:proofErr w:type="spellEnd"/>
-      <w:r>
-        <w:t xml:space="preserve"> </w:t>
-      </w:r>
-      <w:proofErr w:type="spellStart"/>
-      <w:r>
-        <w:t>Distance</w:t>
-      </w:r>
-      <w:proofErr w:type="spellEnd"/>
-    </w:p>
-    <w:p>
-      <w:r>
-        <w:t>Hasil kedua perhitungan dirangkum dalam Tabel II.9 berikut.</w:t>
-      </w:r>
-    </w:p>
-    <w:tbl>
-      <w:tblPr>
-        <w:tblStyle w:val="TableGrid"/>
-        <w:tblW w:w="0" w:type="auto"/>
-        <w:tblLook w:val="04A0" w:firstRow="1" w:lastRow="0" w:firstColumn="1" w:lastColumn="0" w:noHBand="0" w:noVBand="1"/>
-      </w:tblPr>
-      <w:tblGrid>
-        <w:gridCol w:w="1321"/>
-        <w:gridCol w:w="1321"/>
-        <w:gridCol w:w="1321"/>
-        <w:gridCol w:w="1321"/>
-        <w:gridCol w:w="1321"/>
-        <w:gridCol w:w="1322"/>
-      </w:tblGrid>
-      <w:tr>
-        <w:tc>
-          <w:tcPr>
-            <w:tcW w:w="1321" w:type="dxa"/>
-          </w:tcPr>
-          <w:p>
-            <w:pPr>
-              <w:jc w:val="center"/>
-              <w:rPr>
-                <w:b/>
-                <w:bCs/>
-              </w:rPr>
-            </w:pPr>
-            <w:r>
-              <w:rPr>
-                <w:b/>
-                <w:bCs/>
-              </w:rPr>
-              <w:t>Data Latih</w:t>
-            </w:r>
-          </w:p>
-        </w:tc>
-        <w:tc>
-          <w:tcPr>
-            <w:tcW w:w="1321" w:type="dxa"/>
-          </w:tcPr>
-          <w:p>
-            <w:pPr>
-              <w:jc w:val="center"/>
-              <w:rPr>
-                <w:b/>
-                <w:bCs/>
-              </w:rPr>
-            </w:pPr>
-            <w:proofErr w:type="spellStart"/>
-            <w:r>
-              <w:rPr>
-                <w:b/>
-                <w:bCs/>
-              </w:rPr>
-              <w:t>Euclidean</w:t>
-            </w:r>
-            <w:proofErr w:type="spellEnd"/>
-            <w:r>
-              <w:rPr>
-                <w:b/>
-                <w:bCs/>
-              </w:rPr>
-              <w:t xml:space="preserve"> </w:t>
-            </w:r>
-            <w:proofErr w:type="spellStart"/>
-            <w:r>
-              <w:rPr>
-                <w:b/>
-                <w:bCs/>
-              </w:rPr>
-              <w:t>Distance</w:t>
-            </w:r>
-            <w:proofErr w:type="spellEnd"/>
-          </w:p>
-        </w:tc>
-        <w:tc>
-          <w:tcPr>
-            <w:tcW w:w="1321" w:type="dxa"/>
-          </w:tcPr>
-          <w:p>
-            <w:pPr>
-              <w:jc w:val="center"/>
-              <w:rPr>
-                <w:b/>
-                <w:bCs/>
-              </w:rPr>
-            </w:pPr>
-            <w:r>
-              <w:rPr>
-                <w:b/>
-                <w:bCs/>
-              </w:rPr>
-              <w:t>Peringkat</w:t>
-            </w:r>
-          </w:p>
-        </w:tc>
-        <w:tc>
-          <w:tcPr>
-            <w:tcW w:w="1321" w:type="dxa"/>
-          </w:tcPr>
-          <w:p>
-            <w:pPr>
-              <w:jc w:val="center"/>
-              <w:rPr>
-                <w:b/>
-                <w:bCs/>
-              </w:rPr>
-            </w:pPr>
-            <w:proofErr w:type="spellStart"/>
-            <w:r>
-              <w:rPr>
-                <w:b/>
-                <w:bCs/>
-              </w:rPr>
-              <w:t>Cosine</w:t>
-            </w:r>
-            <w:proofErr w:type="spellEnd"/>
-            <w:r>
-              <w:rPr>
-                <w:b/>
-                <w:bCs/>
-              </w:rPr>
-              <w:t xml:space="preserve"> </w:t>
-            </w:r>
-            <w:proofErr w:type="spellStart"/>
-            <w:r>
-              <w:rPr>
-                <w:b/>
-                <w:bCs/>
-              </w:rPr>
-              <w:t>Distance</w:t>
-            </w:r>
-            <w:proofErr w:type="spellEnd"/>
-          </w:p>
-        </w:tc>
-        <w:tc>
-          <w:tcPr>
-            <w:tcW w:w="1321" w:type="dxa"/>
-          </w:tcPr>
-          <w:p>
-            <w:pPr>
-              <w:jc w:val="center"/>
-              <w:rPr>
-                <w:b/>
-                <w:bCs/>
-              </w:rPr>
-            </w:pPr>
-            <w:r>
-              <w:rPr>
-                <w:b/>
-                <w:bCs/>
-              </w:rPr>
-              <w:t>Peringkat</w:t>
-            </w:r>
-          </w:p>
-        </w:tc>
-        <w:tc>
-          <w:tcPr>
-            <w:tcW w:w="1322" w:type="dxa"/>
-          </w:tcPr>
-          <w:p>
-            <w:pPr>
-              <w:jc w:val="center"/>
-              <w:rPr>
-                <w:b/>
-                <w:bCs/>
-              </w:rPr>
-            </w:pPr>
-            <w:r>
-              <w:rPr>
-                <w:b/>
-                <w:bCs/>
-              </w:rPr>
-              <w:t>Label Aktual</w:t>
-            </w:r>
-          </w:p>
-        </w:tc>
-      </w:tr>
-      <w:tr>
-        <w:tc>
-          <w:tcPr>
-            <w:tcW w:w="1321" w:type="dxa"/>
-          </w:tcPr>
-          <w:p>
-            <w:r>
-              <w:t>D3</w:t>
-            </w:r>
-          </w:p>
-        </w:tc>
-        <w:tc>
-          <w:tcPr>
-            <w:tcW w:w="1321" w:type="dxa"/>
-          </w:tcPr>
-          <w:p>
-            <w:r>
-              <w:t>0,2546</w:t>
-            </w:r>
-          </w:p>
-        </w:tc>
-        <w:tc>
-          <w:tcPr>
-            <w:tcW w:w="1321" w:type="dxa"/>
-          </w:tcPr>
-          <w:p>
-            <w:r>
-              <w:t>1</w:t>
-            </w:r>
-          </w:p>
-        </w:tc>
-        <w:tc>
-          <w:tcPr>
-            <w:tcW w:w="1321" w:type="dxa"/>
-          </w:tcPr>
-          <w:p>
-            <w:r>
-              <w:t>0,7113</w:t>
-            </w:r>
-          </w:p>
-        </w:tc>
-        <w:tc>
-          <w:tcPr>
-            <w:tcW w:w="1321" w:type="dxa"/>
-          </w:tcPr>
-          <w:p>
-            <w:r>
-              <w:t>1</w:t>
-            </w:r>
-          </w:p>
-        </w:tc>
-        <w:tc>
-          <w:tcPr>
-            <w:tcW w:w="1322" w:type="dxa"/>
-          </w:tcPr>
-          <w:p>
-            <w:r>
-              <w:t>Negatif</w:t>
-            </w:r>
-          </w:p>
-        </w:tc>
-      </w:tr>
-      <w:tr>
-        <w:tc>
-          <w:tcPr>
-            <w:tcW w:w="1321" w:type="dxa"/>
-          </w:tcPr>
-          <w:p>
-            <w:r>
-              <w:t>D1</w:t>
-            </w:r>
-          </w:p>
-        </w:tc>
-        <w:tc>
-          <w:tcPr>
-            <w:tcW w:w="1321" w:type="dxa"/>
-          </w:tcPr>
-          <w:p>
-            <w:r>
-              <w:t>0,2601</w:t>
-            </w:r>
-          </w:p>
-        </w:tc>
-        <w:tc>
-          <w:tcPr>
-            <w:tcW w:w="1321" w:type="dxa"/>
-          </w:tcPr>
-          <w:p>
-            <w:r>
-              <w:t>2</w:t>
-            </w:r>
-          </w:p>
-        </w:tc>
-        <w:tc>
-          <w:tcPr>
-            <w:tcW w:w="1321" w:type="dxa"/>
-          </w:tcPr>
-          <w:p>
-            <w:r>
-              <w:t>0,7776</w:t>
-            </w:r>
-          </w:p>
-        </w:tc>
-        <w:tc>
-          <w:tcPr>
-            <w:tcW w:w="1321" w:type="dxa"/>
-          </w:tcPr>
-          <w:p>
-            <w:r>
-              <w:t>2</w:t>
-            </w:r>
-          </w:p>
-        </w:tc>
-        <w:tc>
-          <w:tcPr>
-            <w:tcW w:w="1322" w:type="dxa"/>
-          </w:tcPr>
-          <w:p>
-            <w:r>
-              <w:t>Positif</w:t>
-            </w:r>
-          </w:p>
-        </w:tc>
-      </w:tr>
-      <w:tr>
-        <w:tc>
-          <w:tcPr>
-            <w:tcW w:w="1321" w:type="dxa"/>
-          </w:tcPr>
-          <w:p>
-            <w:r>
-              <w:t>D2</w:t>
-            </w:r>
-          </w:p>
-        </w:tc>
-        <w:tc>
-          <w:tcPr>
-            <w:tcW w:w="1321" w:type="dxa"/>
-          </w:tcPr>
-          <w:p>
-            <w:r>
-              <w:t>0,3464</w:t>
-            </w:r>
-          </w:p>
-        </w:tc>
-        <w:tc>
-          <w:tcPr>
-            <w:tcW w:w="1321" w:type="dxa"/>
-          </w:tcPr>
-          <w:p>
-            <w:r>
-              <w:t>3</w:t>
-            </w:r>
-          </w:p>
-        </w:tc>
-        <w:tc>
-          <w:tcPr>
-            <w:tcW w:w="1321" w:type="dxa"/>
-          </w:tcPr>
-          <w:p>
-            <w:r>
-              <w:t>1,0000</w:t>
-            </w:r>
-          </w:p>
-        </w:tc>
-        <w:tc>
-          <w:tcPr>
-            <w:tcW w:w="1321" w:type="dxa"/>
-          </w:tcPr>
-          <w:p>
-            <w:r>
-              <w:t>3</w:t>
-            </w:r>
-          </w:p>
-        </w:tc>
-        <w:tc>
-          <w:tcPr>
-            <w:tcW w:w="1322" w:type="dxa"/>
-          </w:tcPr>
-          <w:p>
-            <w:r>
-              <w:t>Positif</w:t>
-            </w:r>
-          </w:p>
-        </w:tc>
-      </w:tr>
-    </w:tbl>
-    <w:p>
-      <w:r>
-        <w:rPr>
-          <w:color w:val="EE0000"/>
-        </w:rPr>
-        <w:t xml:space="preserve">Perbandingan Peringkat </w:t>
-      </w:r>
-      <w:r>
-        <w:t xml:space="preserve">Jarak </w:t>
-      </w:r>
-      <w:proofErr w:type="spellStart"/>
-      <w:r>
-        <w:t>Euclidean</w:t>
-      </w:r>
-      <w:proofErr w:type="spellEnd"/>
-      <w:r>
-        <w:t xml:space="preserve"> dan </w:t>
-      </w:r>
-      <w:proofErr w:type="spellStart"/>
-      <w:r>
-        <w:t>Cosine</w:t>
-      </w:r>
-      <w:proofErr w:type="spellEnd"/>
-    </w:p>
-    <w:p>
-      <w:r>
-        <w:t>Perhitungan Bobot dan Klasifikasi (K=3)</w:t>
-      </w:r>
-    </w:p>
-    <w:p>
-      <w:r>
-        <w:t xml:space="preserve">Menggunakan persamaan </w:t>
-      </w:r>
-      <m:oMath>
-        <m:r>
-          <w:rPr>
-            <w:rFonts w:ascii="Cambria Math" w:hAnsi="Cambria Math"/>
-          </w:rPr>
-          <m:t>w=</m:t>
-        </m:r>
-        <m:f>
-          <m:fPr>
-            <m:ctrlPr>
-              <w:rPr>
-                <w:rFonts w:ascii="Cambria Math" w:hAnsi="Cambria Math"/>
-              </w:rPr>
-            </m:ctrlPr>
-          </m:fPr>
-          <m:num>
-            <m:r>
-              <w:rPr>
-                <w:rFonts w:ascii="Cambria Math" w:hAnsi="Cambria Math"/>
-              </w:rPr>
-              <m:t>1</m:t>
-            </m:r>
-          </m:num>
-          <m:den>
-            <m:r>
-              <w:rPr>
-                <w:rFonts w:ascii="Cambria Math" w:hAnsi="Cambria Math"/>
-              </w:rPr>
-              <m:t>d+ϵ</m:t>
-            </m:r>
-          </m:den>
-        </m:f>
-      </m:oMath>
-      <w:r>
-        <w:t>, diperoleh bobot masing-masing tetangga sebagai berikut:</w:t>
-      </w:r>
-    </w:p>
-    <w:tbl>
-      <w:tblPr>
-        <w:tblStyle w:val="TableGrid"/>
-        <w:tblW w:w="0" w:type="auto"/>
-        <w:tblLook w:val="04A0" w:firstRow="1" w:lastRow="0" w:firstColumn="1" w:lastColumn="0" w:noHBand="0" w:noVBand="1"/>
-      </w:tblPr>
-      <w:tblGrid>
-        <w:gridCol w:w="1176"/>
-        <w:gridCol w:w="1124"/>
-        <w:gridCol w:w="1096"/>
-        <w:gridCol w:w="1096"/>
-        <w:gridCol w:w="1048"/>
-        <w:gridCol w:w="1077"/>
-        <w:gridCol w:w="1310"/>
-      </w:tblGrid>
-      <w:tr>
-        <w:tc>
-          <w:tcPr>
-            <w:tcW w:w="1177" w:type="dxa"/>
-          </w:tcPr>
-          <w:p>
-            <w:pPr>
-              <w:jc w:val="center"/>
-              <w:rPr>
-                <w:b/>
-                <w:bCs/>
-              </w:rPr>
-            </w:pPr>
-            <w:r>
-              <w:rPr>
-                <w:b/>
-                <w:bCs/>
-              </w:rPr>
-              <w:t>Metrik</w:t>
-            </w:r>
-          </w:p>
-        </w:tc>
-        <w:tc>
-          <w:tcPr>
-            <w:tcW w:w="1124" w:type="dxa"/>
-          </w:tcPr>
-          <w:p>
-            <w:pPr>
-              <w:jc w:val="center"/>
-              <w:rPr>
-                <w:b/>
-                <w:bCs/>
-              </w:rPr>
-            </w:pPr>
-            <w:r>
-              <w:rPr>
-                <w:b/>
-                <w:bCs/>
-              </w:rPr>
-              <w:t>Bobot D3 (Negatif)</w:t>
-            </w:r>
-          </w:p>
-        </w:tc>
-        <w:tc>
-          <w:tcPr>
-            <w:tcW w:w="1104" w:type="dxa"/>
-          </w:tcPr>
-          <w:p>
-            <w:pPr>
-              <w:jc w:val="center"/>
-              <w:rPr>
-                <w:b/>
-                <w:bCs/>
-              </w:rPr>
-            </w:pPr>
-            <w:r>
-              <w:rPr>
-                <w:b/>
-                <w:bCs/>
-              </w:rPr>
-              <w:t>Bobot D1 (Positif)</w:t>
-            </w:r>
-          </w:p>
-        </w:tc>
-        <w:tc>
-          <w:tcPr>
-            <w:tcW w:w="1104" w:type="dxa"/>
-          </w:tcPr>
-          <w:p>
-            <w:pPr>
-              <w:jc w:val="center"/>
-              <w:rPr>
-                <w:b/>
-                <w:bCs/>
-              </w:rPr>
-            </w:pPr>
-            <w:r>
-              <w:rPr>
-                <w:b/>
-                <w:bCs/>
-              </w:rPr>
-              <w:t>Bobot D2 (Positif)</w:t>
-            </w:r>
-          </w:p>
-        </w:tc>
-        <w:tc>
-          <w:tcPr>
-            <w:tcW w:w="1071" w:type="dxa"/>
-          </w:tcPr>
-          <w:p>
-            <w:pPr>
-              <w:jc w:val="center"/>
-              <w:rPr>
-                <w:b/>
-                <w:bCs/>
-              </w:rPr>
-            </w:pPr>
-            <w:r>
-              <w:rPr>
-                <w:b/>
-                <w:bCs/>
-              </w:rPr>
-              <w:t>Total Positif</w:t>
-            </w:r>
-          </w:p>
-        </w:tc>
-        <w:tc>
-          <w:tcPr>
-            <w:tcW w:w="1091" w:type="dxa"/>
-          </w:tcPr>
-          <w:p>
-            <w:pPr>
-              <w:jc w:val="center"/>
-              <w:rPr>
-                <w:b/>
-                <w:bCs/>
-              </w:rPr>
-            </w:pPr>
-            <w:r>
-              <w:rPr>
-                <w:b/>
-                <w:bCs/>
-              </w:rPr>
-              <w:t>Total Negatif</w:t>
-            </w:r>
-          </w:p>
-        </w:tc>
-        <w:tc>
-          <w:tcPr>
-            <w:tcW w:w="1256" w:type="dxa"/>
-          </w:tcPr>
-          <w:p>
-            <w:pPr>
-              <w:jc w:val="center"/>
-              <w:rPr>
-                <w:b/>
-                <w:bCs/>
-              </w:rPr>
-            </w:pPr>
-            <w:r>
-              <w:rPr>
-                <w:b/>
-                <w:bCs/>
-              </w:rPr>
-              <w:t>Hasil Klasifikasi</w:t>
-            </w:r>
-          </w:p>
-        </w:tc>
-      </w:tr>
-      <w:tr>
-        <w:tc>
-          <w:tcPr>
-            <w:tcW w:w="1177" w:type="dxa"/>
-          </w:tcPr>
-          <w:p>
-            <w:proofErr w:type="spellStart"/>
-            <w:r>
-              <w:lastRenderedPageBreak/>
-              <w:t>Euclidean</w:t>
-            </w:r>
-            <w:proofErr w:type="spellEnd"/>
-          </w:p>
-        </w:tc>
-        <w:tc>
-          <w:tcPr>
-            <w:tcW w:w="1124" w:type="dxa"/>
-          </w:tcPr>
-          <w:p>
-            <w:r>
-              <w:t>3,929</w:t>
-            </w:r>
-          </w:p>
-        </w:tc>
-        <w:tc>
-          <w:tcPr>
-            <w:tcW w:w="1104" w:type="dxa"/>
-          </w:tcPr>
-          <w:p>
-            <w:r>
-              <w:t>3,845</w:t>
-            </w:r>
-          </w:p>
-        </w:tc>
-        <w:tc>
-          <w:tcPr>
-            <w:tcW w:w="1104" w:type="dxa"/>
-          </w:tcPr>
-          <w:p>
-            <w:r>
-              <w:t>2,887</w:t>
-            </w:r>
-          </w:p>
-        </w:tc>
-        <w:tc>
-          <w:tcPr>
-            <w:tcW w:w="1071" w:type="dxa"/>
-          </w:tcPr>
-          <w:p>
-            <w:r>
-              <w:t>6,732</w:t>
-            </w:r>
-          </w:p>
-        </w:tc>
-        <w:tc>
-          <w:tcPr>
-            <w:tcW w:w="1091" w:type="dxa"/>
-          </w:tcPr>
-          <w:p>
-            <w:r>
-              <w:t>3,929</w:t>
-            </w:r>
-          </w:p>
-        </w:tc>
-        <w:tc>
-          <w:tcPr>
-            <w:tcW w:w="1256" w:type="dxa"/>
-          </w:tcPr>
-          <w:p>
-            <w:r>
-              <w:t>Positif</w:t>
-            </w:r>
-          </w:p>
-        </w:tc>
-      </w:tr>
-      <w:tr>
-        <w:tc>
-          <w:tcPr>
-            <w:tcW w:w="1177" w:type="dxa"/>
-          </w:tcPr>
-          <w:p>
-            <w:proofErr w:type="spellStart"/>
-            <w:r>
-              <w:t>Cosine</w:t>
-            </w:r>
-            <w:proofErr w:type="spellEnd"/>
-          </w:p>
-        </w:tc>
-        <w:tc>
-          <w:tcPr>
-            <w:tcW w:w="1124" w:type="dxa"/>
-          </w:tcPr>
-          <w:p>
-            <w:r>
-              <w:t>1,406</w:t>
-            </w:r>
-          </w:p>
-        </w:tc>
-        <w:tc>
-          <w:tcPr>
-            <w:tcW w:w="1104" w:type="dxa"/>
-          </w:tcPr>
-          <w:p>
-            <w:r>
-              <w:t>1,286</w:t>
-            </w:r>
-          </w:p>
-        </w:tc>
-        <w:tc>
-          <w:tcPr>
-            <w:tcW w:w="1104" w:type="dxa"/>
-          </w:tcPr>
-          <w:p>
-            <w:r>
-              <w:t>1,000</w:t>
-            </w:r>
-          </w:p>
-        </w:tc>
-        <w:tc>
-          <w:tcPr>
-            <w:tcW w:w="1071" w:type="dxa"/>
-          </w:tcPr>
-          <w:p>
-            <w:r>
-              <w:t>2,286</w:t>
-            </w:r>
-          </w:p>
-        </w:tc>
-        <w:tc>
-          <w:tcPr>
-            <w:tcW w:w="1091" w:type="dxa"/>
-          </w:tcPr>
-          <w:p>
-            <w:r>
-              <w:t>1,406</w:t>
-            </w:r>
-          </w:p>
-        </w:tc>
-        <w:tc>
-          <w:tcPr>
-            <w:tcW w:w="1256" w:type="dxa"/>
-          </w:tcPr>
-          <w:p>
-            <w:r>
-              <w:t>Positif</w:t>
-            </w:r>
-          </w:p>
-        </w:tc>
-      </w:tr>
-    </w:tbl>
-    <w:p>
-      <w:r>
-        <w:t>Perb</w:t>
-      </w:r>
-      <w:r>
-        <w:rPr>
-          <w:color w:val="EE0000"/>
-        </w:rPr>
-        <w:t>andinga</w:t>
-      </w:r>
-      <w:r>
-        <w:t>n Hasil Klasifikasi Berdasarkan Metrik Jarak</w:t>
-      </w:r>
-    </w:p>
-    <w:p>
-      <w:r>
-        <w:tab/>
-      </w:r>
-      <w:r>
-        <w:t xml:space="preserve">Pada ilustrasi ini, kedua metrik jarak menghasilkan keputusan klasifikasi yang sama (Positif) untuk data uji U1, namun dengan margin keunggulan yang berbeda: metrik </w:t>
-      </w:r>
-      <w:proofErr w:type="spellStart"/>
-      <w:r>
-        <w:t>Euclidean</w:t>
-      </w:r>
-      <w:proofErr w:type="spellEnd"/>
-      <w:r>
-        <w:t xml:space="preserve"> menghasilkan rasio bobot Positif terhadap Negatif sebesar 1,71 kali, sedangkan metrik </w:t>
-      </w:r>
-      <w:proofErr w:type="spellStart"/>
-      <w:r>
-        <w:t>Cosine</w:t>
-      </w:r>
-      <w:proofErr w:type="spellEnd"/>
-      <w:r>
-        <w:t xml:space="preserve"> menghasilkan rasio sebesar 1,63 kali. Perbedaan margin ini menunjukkan bahwa meskipun hasil akhir klasifikasi dapat konsisten pada sampel kecil, kedua metrik memiliki karakteristik sensitivitas yang berbeda, yang berpotensi menghasilkan perbedaan signifikan ketika diterapkan pada skala data yang lebih besar dan bervariasi.</w:t>
       </w:r>
     </w:p>
     <w:p>
@@ -48486,12 +45776,14 @@
     <w:rsid w:val="002033FA"/>
     <w:rsid w:val="00234C54"/>
     <w:rsid w:val="00275335"/>
+    <w:rsid w:val="00297257"/>
     <w:rsid w:val="00375E1A"/>
     <w:rsid w:val="004C03EB"/>
     <w:rsid w:val="004C5BA5"/>
     <w:rsid w:val="00500DC0"/>
     <w:rsid w:val="005E0893"/>
     <w:rsid w:val="006A22F7"/>
+    <w:rsid w:val="007A5C34"/>
     <w:rsid w:val="0086541E"/>
     <w:rsid w:val="00902DE1"/>
     <w:rsid w:val="00A700CA"/>

</xml_diff>